<commit_message>
esp32: the LED ring is 16 pixels, not 11
Firmware NUM_PIXELS, the docs and the hardware schematic now match the
16-LED WS2812B ring actually fitted in the box.
</commit_message>
<xml_diff>
--- a/Hardware Schematic.docx
+++ b/Hardware Schematic.docx
@@ -478,7 +478,7 @@
                 <w:sz w:val="19"/>
                 <w:szCs w:val="19"/>
               </w:rPr>
-              <w:t xml:space="preserve">2 (up to 4)</w:t>
+              <w:t xml:space="preserve">4</w:t>
             </w:r>
           </w:p>
         </w:tc>
@@ -504,7 +504,7 @@
                 <w:sz w:val="19"/>
                 <w:szCs w:val="19"/>
               </w:rPr>
-              <w:t xml:space="preserve">Smoke and gas at separate points in the room</w:t>
+              <w:t xml:space="preserve">Smoke and gas at four separate points in the room</w:t>
             </w:r>
           </w:p>
         </w:tc>
@@ -644,7 +644,7 @@
                 <w:sz w:val="19"/>
                 <w:szCs w:val="19"/>
               </w:rPr>
-              <w:t xml:space="preserve">2 (up to 4)</w:t>
+              <w:t xml:space="preserve">4</w:t>
             </w:r>
           </w:p>
         </w:tc>
@@ -810,7 +810,7 @@
                 <w:sz w:val="19"/>
                 <w:szCs w:val="19"/>
               </w:rPr>
-              <w:t xml:space="preserve">11 LEDs</w:t>
+              <w:t xml:space="preserve">16 LEDs</w:t>
             </w:r>
           </w:p>
         </w:tc>
@@ -1251,7 +1251,7 @@
                 <w:sz w:val="19"/>
                 <w:szCs w:val="19"/>
               </w:rPr>
-              <w:t xml:space="preserve">Aim the IR transmitters; two reserved for more transmitters</w:t>
+              <w:t xml:space="preserve">Aim the four IR transmitters</w:t>
             </w:r>
           </w:p>
         </w:tc>
@@ -1280,7 +1280,7 @@
           <w:sz w:val="20"/>
           <w:szCs w:val="20"/>
         </w:rPr>
-        <w:t xml:space="preserve">Figure 1. Wiring schematic</w:t>
+        <w:t xml:space="preserve">Figure 1. Wiring schematic (3D view)</w:t>
       </w:r>
     </w:p>
     <w:p>
@@ -1290,9 +1290,9 @@
       <w:r>
         <w:drawing>
           <wp:inline distT="0" distB="0" distL="0" distR="0">
-            <wp:extent cx="9144000" cy="6096000"/>
+            <wp:extent cx="6829425" cy="6781800"/>
             <wp:effectExtent t="0" r="0" b="0" l="0"/>
-            <wp:docPr id="1" name="schematic" descr="ESP32 with every module and the GPIO each uses" title="Schematic"/>
+            <wp:docPr id="1" name="schematic" descr="3D view of the ESP32 shield with every module and the GPIO each uses" title="Schematic"/>
             <wp:cNvGraphicFramePr>
               <a:graphicFrameLocks xmlns:a="http://schemas.openxmlformats.org/drawingml/2006/main" noChangeAspect="1"/>
             </wp:cNvGraphicFramePr>
@@ -1315,7 +1315,7 @@
                   <pic:spPr bwMode="auto">
                     <a:xfrm>
                       <a:off x="0" y="0"/>
-                      <a:ext cx="9144000" cy="6096000"/>
+                      <a:ext cx="6829425" cy="6781800"/>
                     </a:xfrm>
                     <a:prstGeom prst="rect">
                       <a:avLst/>
@@ -1341,7 +1341,7 @@
           <w:sz w:val="17"/>
           <w:szCs w:val="17"/>
         </w:rPr>
-        <w:t xml:space="preserve">Rail labels (5V / 3V3 / GND) connect to the matching row on the ESP32 shield. Dashed parts are spare channels, not yet wired.</w:t>
+        <w:t xml:space="preserve">Rail labels (5V / 3V3 / GND) connect to the matching row on the ESP32 shield.</w:t>
       </w:r>
     </w:p>
     <w:p>
@@ -1349,7 +1349,7 @@
         <w:sectPr>
           <w:footerReference w:type="default" r:id="rId7"/>
           <w:pgSz w:w="15840" w:h="12240" w:orient="landscape"/>
-          <w:pgMar w:top="600" w:right="720" w:bottom="600" w:left="720" w:header="708" w:footer="300" w:gutter="0"/>
+          <w:pgMar w:top="432" w:right="576" w:bottom="432" w:left="576" w:header="708" w:footer="240" w:gutter="0"/>
           <w:pgNumType/>
           <w:docGrid w:linePitch="360"/>
         </w:sectPr>
@@ -1921,7 +1921,7 @@
                 <w:sz w:val="19"/>
                 <w:szCs w:val="19"/>
               </w:rPr>
-              <w:t xml:space="preserve">Through the 10 kΩ / 20 kΩ divider</w:t>
+              <w:t xml:space="preserve">AO → 10 kΩ → GPIO34; 20 kΩ from GPIO34 to GND</w:t>
             </w:r>
           </w:p>
         </w:tc>
@@ -2162,7 +2162,7 @@
                 <w:sz w:val="19"/>
                 <w:szCs w:val="19"/>
               </w:rPr>
-              <w:t xml:space="preserve">MQ-2 #3 (spare)</w:t>
+              <w:t xml:space="preserve">MQ-2 #3</w:t>
             </w:r>
           </w:p>
         </w:tc>
@@ -2188,7 +2188,7 @@
                 <w:sz w:val="19"/>
                 <w:szCs w:val="19"/>
               </w:rPr>
-              <w:t xml:space="preserve">AO</w:t>
+              <w:t xml:space="preserve">VCC / GND</w:t>
             </w:r>
           </w:p>
         </w:tc>
@@ -2214,7 +2214,7 @@
                 <w:sz w:val="19"/>
                 <w:szCs w:val="19"/>
               </w:rPr>
-              <w:t xml:space="preserve">GPIO36</w:t>
+              <w:t xml:space="preserve">Shield 5V pin / GND</w:t>
             </w:r>
           </w:p>
         </w:tc>
@@ -2234,15 +2234,7 @@
               <w:right w:type="dxa" w:w="100"/>
             </w:tcMar>
           </w:tcPr>
-          <w:p>
-            <w:r>
-              <w:rPr>
-                <w:sz w:val="19"/>
-                <w:szCs w:val="19"/>
-              </w:rPr>
-              <w:t xml:space="preserve">Divider needed; enable the channel in the dashboard</w:t>
-            </w:r>
-          </w:p>
+          <w:p/>
         </w:tc>
       </w:tr>
       <w:tr>
@@ -2271,7 +2263,7 @@
                 <w:sz w:val="19"/>
                 <w:szCs w:val="19"/>
               </w:rPr>
-              <w:t xml:space="preserve">MQ-2 #4 (spare)</w:t>
+              <w:t xml:space="preserve">MQ-2 #3</w:t>
             </w:r>
           </w:p>
         </w:tc>
@@ -2323,7 +2315,7 @@
                 <w:sz w:val="19"/>
                 <w:szCs w:val="19"/>
               </w:rPr>
-              <w:t xml:space="preserve">GPIO39</w:t>
+              <w:t xml:space="preserve">VP (GPIO36)</w:t>
             </w:r>
           </w:p>
         </w:tc>
@@ -2349,7 +2341,7 @@
                 <w:sz w:val="19"/>
                 <w:szCs w:val="19"/>
               </w:rPr>
-              <w:t xml:space="preserve">Divider needed; enable the channel in the dashboard</w:t>
+              <w:t xml:space="preserve">Through its own divider; enable channel 3 in the dashboard</w:t>
             </w:r>
           </w:p>
         </w:tc>
@@ -2380,7 +2372,7 @@
                 <w:sz w:val="19"/>
                 <w:szCs w:val="19"/>
               </w:rPr>
-              <w:t xml:space="preserve">KY-005 IR #1</w:t>
+              <w:t xml:space="preserve">MQ-2 #4</w:t>
             </w:r>
           </w:p>
         </w:tc>
@@ -2406,7 +2398,7 @@
                 <w:sz w:val="19"/>
                 <w:szCs w:val="19"/>
               </w:rPr>
-              <w:t xml:space="preserve">S / −</w:t>
+              <w:t xml:space="preserve">VCC / GND</w:t>
             </w:r>
           </w:p>
         </w:tc>
@@ -2432,7 +2424,7 @@
                 <w:sz w:val="19"/>
                 <w:szCs w:val="19"/>
               </w:rPr>
-              <w:t xml:space="preserve">GPIO25 / GND</w:t>
+              <w:t xml:space="preserve">Shield 5V pin / GND</w:t>
             </w:r>
           </w:p>
         </w:tc>
@@ -2452,15 +2444,7 @@
               <w:right w:type="dxa" w:w="100"/>
             </w:tcMar>
           </w:tcPr>
-          <w:p>
-            <w:r>
-              <w:rPr>
-                <w:sz w:val="19"/>
-                <w:szCs w:val="19"/>
-              </w:rPr>
-              <w:t xml:space="preserve">AC unit 1</w:t>
-            </w:r>
-          </w:p>
+          <w:p/>
         </w:tc>
       </w:tr>
       <w:tr>
@@ -2489,7 +2473,7 @@
                 <w:sz w:val="19"/>
                 <w:szCs w:val="19"/>
               </w:rPr>
-              <w:t xml:space="preserve">KY-005 IR #2</w:t>
+              <w:t xml:space="preserve">MQ-2 #4</w:t>
             </w:r>
           </w:p>
         </w:tc>
@@ -2515,7 +2499,7 @@
                 <w:sz w:val="19"/>
                 <w:szCs w:val="19"/>
               </w:rPr>
-              <w:t xml:space="preserve">S / −</w:t>
+              <w:t xml:space="preserve">AO</w:t>
             </w:r>
           </w:p>
         </w:tc>
@@ -2541,7 +2525,7 @@
                 <w:sz w:val="19"/>
                 <w:szCs w:val="19"/>
               </w:rPr>
-              <w:t xml:space="preserve">GPIO33 / GND</w:t>
+              <w:t xml:space="preserve">VN (GPIO39)</w:t>
             </w:r>
           </w:p>
         </w:tc>
@@ -2567,7 +2551,7 @@
                 <w:sz w:val="19"/>
                 <w:szCs w:val="19"/>
               </w:rPr>
-              <w:t xml:space="preserve">AC unit 2</w:t>
+              <w:t xml:space="preserve">Through its own divider; enable channel 4 in the dashboard</w:t>
             </w:r>
           </w:p>
         </w:tc>
@@ -2598,7 +2582,7 @@
                 <w:sz w:val="19"/>
                 <w:szCs w:val="19"/>
               </w:rPr>
-              <w:t xml:space="preserve">IR #3 / #4 (spare)</w:t>
+              <w:t xml:space="preserve">KY-005 IR #1</w:t>
             </w:r>
           </w:p>
         </w:tc>
@@ -2624,7 +2608,7 @@
                 <w:sz w:val="19"/>
                 <w:szCs w:val="19"/>
               </w:rPr>
-              <w:t xml:space="preserve">S</w:t>
+              <w:t xml:space="preserve">S / −</w:t>
             </w:r>
           </w:p>
         </w:tc>
@@ -2650,7 +2634,7 @@
                 <w:sz w:val="19"/>
                 <w:szCs w:val="19"/>
               </w:rPr>
-              <w:t xml:space="preserve">GPIO32 / GPIO15</w:t>
+              <w:t xml:space="preserve">GPIO25 / GND</w:t>
             </w:r>
           </w:p>
         </w:tc>
@@ -2676,7 +2660,334 @@
                 <w:sz w:val="19"/>
                 <w:szCs w:val="19"/>
               </w:rPr>
-              <w:t xml:space="preserve">Register the AC unit in the dashboard</w:t>
+              <w:t xml:space="preserve">IR channel 1</w:t>
+            </w:r>
+          </w:p>
+        </w:tc>
+      </w:tr>
+      <w:tr>
+        <w:trPr>
+          <w:cantSplit/>
+        </w:trPr>
+        <w:tc>
+          <w:tcPr>
+            <w:tcW w:type="dxa" w:w="2350"/>
+            <w:tcBorders>
+              <w:top w:val="single" w:color="BFC7D1" w:sz="4"/>
+              <w:left w:val="single" w:color="BFC7D1" w:sz="4"/>
+              <w:bottom w:val="single" w:color="BFC7D1" w:sz="4"/>
+              <w:right w:val="single" w:color="BFC7D1" w:sz="4"/>
+            </w:tcBorders>
+            <w:tcMar>
+              <w:top w:type="dxa" w:w="60"/>
+              <w:left w:type="dxa" w:w="100"/>
+              <w:bottom w:type="dxa" w:w="60"/>
+              <w:right w:type="dxa" w:w="100"/>
+            </w:tcMar>
+          </w:tcPr>
+          <w:p>
+            <w:r>
+              <w:rPr>
+                <w:sz w:val="19"/>
+                <w:szCs w:val="19"/>
+              </w:rPr>
+              <w:t xml:space="preserve">KY-005 IR #2</w:t>
+            </w:r>
+          </w:p>
+        </w:tc>
+        <w:tc>
+          <w:tcPr>
+            <w:tcW w:type="dxa" w:w="1250"/>
+            <w:tcBorders>
+              <w:top w:val="single" w:color="BFC7D1" w:sz="4"/>
+              <w:left w:val="single" w:color="BFC7D1" w:sz="4"/>
+              <w:bottom w:val="single" w:color="BFC7D1" w:sz="4"/>
+              <w:right w:val="single" w:color="BFC7D1" w:sz="4"/>
+            </w:tcBorders>
+            <w:tcMar>
+              <w:top w:type="dxa" w:w="60"/>
+              <w:left w:type="dxa" w:w="100"/>
+              <w:bottom w:type="dxa" w:w="60"/>
+              <w:right w:type="dxa" w:w="100"/>
+            </w:tcMar>
+          </w:tcPr>
+          <w:p>
+            <w:r>
+              <w:rPr>
+                <w:sz w:val="19"/>
+                <w:szCs w:val="19"/>
+              </w:rPr>
+              <w:t xml:space="preserve">S / −</w:t>
+            </w:r>
+          </w:p>
+        </w:tc>
+        <w:tc>
+          <w:tcPr>
+            <w:tcW w:type="dxa" w:w="2050"/>
+            <w:tcBorders>
+              <w:top w:val="single" w:color="BFC7D1" w:sz="4"/>
+              <w:left w:val="single" w:color="BFC7D1" w:sz="4"/>
+              <w:bottom w:val="single" w:color="BFC7D1" w:sz="4"/>
+              <w:right w:val="single" w:color="BFC7D1" w:sz="4"/>
+            </w:tcBorders>
+            <w:tcMar>
+              <w:top w:type="dxa" w:w="60"/>
+              <w:left w:type="dxa" w:w="100"/>
+              <w:bottom w:type="dxa" w:w="60"/>
+              <w:right w:type="dxa" w:w="100"/>
+            </w:tcMar>
+          </w:tcPr>
+          <w:p>
+            <w:r>
+              <w:rPr>
+                <w:sz w:val="19"/>
+                <w:szCs w:val="19"/>
+              </w:rPr>
+              <w:t xml:space="preserve">GPIO33 / GND</w:t>
+            </w:r>
+          </w:p>
+        </w:tc>
+        <w:tc>
+          <w:tcPr>
+            <w:tcW w:type="dxa" w:w="3710"/>
+            <w:tcBorders>
+              <w:top w:val="single" w:color="BFC7D1" w:sz="4"/>
+              <w:left w:val="single" w:color="BFC7D1" w:sz="4"/>
+              <w:bottom w:val="single" w:color="BFC7D1" w:sz="4"/>
+              <w:right w:val="single" w:color="BFC7D1" w:sz="4"/>
+            </w:tcBorders>
+            <w:tcMar>
+              <w:top w:type="dxa" w:w="60"/>
+              <w:left w:type="dxa" w:w="100"/>
+              <w:bottom w:type="dxa" w:w="60"/>
+              <w:right w:type="dxa" w:w="100"/>
+            </w:tcMar>
+          </w:tcPr>
+          <w:p>
+            <w:r>
+              <w:rPr>
+                <w:sz w:val="19"/>
+                <w:szCs w:val="19"/>
+              </w:rPr>
+              <w:t xml:space="preserve">IR channel 2</w:t>
+            </w:r>
+          </w:p>
+        </w:tc>
+      </w:tr>
+      <w:tr>
+        <w:trPr>
+          <w:cantSplit/>
+        </w:trPr>
+        <w:tc>
+          <w:tcPr>
+            <w:tcW w:type="dxa" w:w="2350"/>
+            <w:tcBorders>
+              <w:top w:val="single" w:color="BFC7D1" w:sz="4"/>
+              <w:left w:val="single" w:color="BFC7D1" w:sz="4"/>
+              <w:bottom w:val="single" w:color="BFC7D1" w:sz="4"/>
+              <w:right w:val="single" w:color="BFC7D1" w:sz="4"/>
+            </w:tcBorders>
+            <w:tcMar>
+              <w:top w:type="dxa" w:w="60"/>
+              <w:left w:type="dxa" w:w="100"/>
+              <w:bottom w:type="dxa" w:w="60"/>
+              <w:right w:type="dxa" w:w="100"/>
+            </w:tcMar>
+          </w:tcPr>
+          <w:p>
+            <w:r>
+              <w:rPr>
+                <w:sz w:val="19"/>
+                <w:szCs w:val="19"/>
+              </w:rPr>
+              <w:t xml:space="preserve">KY-005 IR #3</w:t>
+            </w:r>
+          </w:p>
+        </w:tc>
+        <w:tc>
+          <w:tcPr>
+            <w:tcW w:type="dxa" w:w="1250"/>
+            <w:tcBorders>
+              <w:top w:val="single" w:color="BFC7D1" w:sz="4"/>
+              <w:left w:val="single" w:color="BFC7D1" w:sz="4"/>
+              <w:bottom w:val="single" w:color="BFC7D1" w:sz="4"/>
+              <w:right w:val="single" w:color="BFC7D1" w:sz="4"/>
+            </w:tcBorders>
+            <w:tcMar>
+              <w:top w:type="dxa" w:w="60"/>
+              <w:left w:type="dxa" w:w="100"/>
+              <w:bottom w:type="dxa" w:w="60"/>
+              <w:right w:type="dxa" w:w="100"/>
+            </w:tcMar>
+          </w:tcPr>
+          <w:p>
+            <w:r>
+              <w:rPr>
+                <w:sz w:val="19"/>
+                <w:szCs w:val="19"/>
+              </w:rPr>
+              <w:t xml:space="preserve">S / −</w:t>
+            </w:r>
+          </w:p>
+        </w:tc>
+        <w:tc>
+          <w:tcPr>
+            <w:tcW w:type="dxa" w:w="2050"/>
+            <w:tcBorders>
+              <w:top w:val="single" w:color="BFC7D1" w:sz="4"/>
+              <w:left w:val="single" w:color="BFC7D1" w:sz="4"/>
+              <w:bottom w:val="single" w:color="BFC7D1" w:sz="4"/>
+              <w:right w:val="single" w:color="BFC7D1" w:sz="4"/>
+            </w:tcBorders>
+            <w:tcMar>
+              <w:top w:type="dxa" w:w="60"/>
+              <w:left w:type="dxa" w:w="100"/>
+              <w:bottom w:type="dxa" w:w="60"/>
+              <w:right w:type="dxa" w:w="100"/>
+            </w:tcMar>
+          </w:tcPr>
+          <w:p>
+            <w:r>
+              <w:rPr>
+                <w:sz w:val="19"/>
+                <w:szCs w:val="19"/>
+              </w:rPr>
+              <w:t xml:space="preserve">GPIO32 / GND</w:t>
+            </w:r>
+          </w:p>
+        </w:tc>
+        <w:tc>
+          <w:tcPr>
+            <w:tcW w:type="dxa" w:w="3710"/>
+            <w:tcBorders>
+              <w:top w:val="single" w:color="BFC7D1" w:sz="4"/>
+              <w:left w:val="single" w:color="BFC7D1" w:sz="4"/>
+              <w:bottom w:val="single" w:color="BFC7D1" w:sz="4"/>
+              <w:right w:val="single" w:color="BFC7D1" w:sz="4"/>
+            </w:tcBorders>
+            <w:tcMar>
+              <w:top w:type="dxa" w:w="60"/>
+              <w:left w:type="dxa" w:w="100"/>
+              <w:bottom w:type="dxa" w:w="60"/>
+              <w:right w:type="dxa" w:w="100"/>
+            </w:tcMar>
+          </w:tcPr>
+          <w:p>
+            <w:r>
+              <w:rPr>
+                <w:sz w:val="19"/>
+                <w:szCs w:val="19"/>
+              </w:rPr>
+              <w:t xml:space="preserve">IR channel 3; register its AC unit in the dashboard</w:t>
+            </w:r>
+          </w:p>
+        </w:tc>
+      </w:tr>
+      <w:tr>
+        <w:trPr>
+          <w:cantSplit/>
+        </w:trPr>
+        <w:tc>
+          <w:tcPr>
+            <w:tcW w:type="dxa" w:w="2350"/>
+            <w:tcBorders>
+              <w:top w:val="single" w:color="BFC7D1" w:sz="4"/>
+              <w:left w:val="single" w:color="BFC7D1" w:sz="4"/>
+              <w:bottom w:val="single" w:color="BFC7D1" w:sz="4"/>
+              <w:right w:val="single" w:color="BFC7D1" w:sz="4"/>
+            </w:tcBorders>
+            <w:tcMar>
+              <w:top w:type="dxa" w:w="60"/>
+              <w:left w:type="dxa" w:w="100"/>
+              <w:bottom w:type="dxa" w:w="60"/>
+              <w:right w:type="dxa" w:w="100"/>
+            </w:tcMar>
+          </w:tcPr>
+          <w:p>
+            <w:r>
+              <w:rPr>
+                <w:sz w:val="19"/>
+                <w:szCs w:val="19"/>
+              </w:rPr>
+              <w:t xml:space="preserve">KY-005 IR #4</w:t>
+            </w:r>
+          </w:p>
+        </w:tc>
+        <w:tc>
+          <w:tcPr>
+            <w:tcW w:type="dxa" w:w="1250"/>
+            <w:tcBorders>
+              <w:top w:val="single" w:color="BFC7D1" w:sz="4"/>
+              <w:left w:val="single" w:color="BFC7D1" w:sz="4"/>
+              <w:bottom w:val="single" w:color="BFC7D1" w:sz="4"/>
+              <w:right w:val="single" w:color="BFC7D1" w:sz="4"/>
+            </w:tcBorders>
+            <w:tcMar>
+              <w:top w:type="dxa" w:w="60"/>
+              <w:left w:type="dxa" w:w="100"/>
+              <w:bottom w:type="dxa" w:w="60"/>
+              <w:right w:type="dxa" w:w="100"/>
+            </w:tcMar>
+          </w:tcPr>
+          <w:p>
+            <w:r>
+              <w:rPr>
+                <w:sz w:val="19"/>
+                <w:szCs w:val="19"/>
+              </w:rPr>
+              <w:t xml:space="preserve">S / −</w:t>
+            </w:r>
+          </w:p>
+        </w:tc>
+        <w:tc>
+          <w:tcPr>
+            <w:tcW w:type="dxa" w:w="2050"/>
+            <w:tcBorders>
+              <w:top w:val="single" w:color="BFC7D1" w:sz="4"/>
+              <w:left w:val="single" w:color="BFC7D1" w:sz="4"/>
+              <w:bottom w:val="single" w:color="BFC7D1" w:sz="4"/>
+              <w:right w:val="single" w:color="BFC7D1" w:sz="4"/>
+            </w:tcBorders>
+            <w:tcMar>
+              <w:top w:type="dxa" w:w="60"/>
+              <w:left w:type="dxa" w:w="100"/>
+              <w:bottom w:type="dxa" w:w="60"/>
+              <w:right w:type="dxa" w:w="100"/>
+            </w:tcMar>
+          </w:tcPr>
+          <w:p>
+            <w:r>
+              <w:rPr>
+                <w:sz w:val="19"/>
+                <w:szCs w:val="19"/>
+              </w:rPr>
+              <w:t xml:space="preserve">GPIO15 / GND</w:t>
+            </w:r>
+          </w:p>
+        </w:tc>
+        <w:tc>
+          <w:tcPr>
+            <w:tcW w:type="dxa" w:w="3710"/>
+            <w:tcBorders>
+              <w:top w:val="single" w:color="BFC7D1" w:sz="4"/>
+              <w:left w:val="single" w:color="BFC7D1" w:sz="4"/>
+              <w:bottom w:val="single" w:color="BFC7D1" w:sz="4"/>
+              <w:right w:val="single" w:color="BFC7D1" w:sz="4"/>
+            </w:tcBorders>
+            <w:tcMar>
+              <w:top w:type="dxa" w:w="60"/>
+              <w:left w:type="dxa" w:w="100"/>
+              <w:bottom w:type="dxa" w:w="60"/>
+              <w:right w:type="dxa" w:w="100"/>
+            </w:tcMar>
+          </w:tcPr>
+          <w:p>
+            <w:r>
+              <w:rPr>
+                <w:sz w:val="19"/>
+                <w:szCs w:val="19"/>
+              </w:rPr>
+              <w:t xml:space="preserve">IR channel 4; register its AC unit in the dashboard</w:t>
             </w:r>
           </w:p>
         </w:tc>
@@ -3822,10 +4133,10 @@
           <w:b/>
           <w:bCs/>
         </w:rPr>
-        <w:t xml:space="preserve">GPIO36 and GPIO39 are input-only.</w:t>
+        <w:t xml:space="preserve">VP and VN are input-only.</w:t>
       </w:r>
       <w:r>
-        <w:t xml:space="preserve"> They are fine for the spare MQ-2 sensors but cannot drive an IR transmitter, which is why the spare IR channels are on GPIO32 and GPIO15.</w:t>
+        <w:t xml:space="preserve"> On the board they are printed VP and VN, not GPIO36 and GPIO39. They are fine for MQ-2 #3 and #4 but cannot drive an IR transmitter, which is why IR #3 and #4 are on GPIO32 and GPIO15.</w:t>
       </w:r>
     </w:p>
     <w:p>

</xml_diff>